<commit_message>
feat: Implementação do relatório da OS com geração a partir de template Word
- Adicionada a classe OsReportGenerator para gerar relatórios da OS a partir do template core/template/MODELO_RELATORIO_OS.docx.
- Implementada a formatação de números inteiros e decimais no padrão brasileiro em FormatUtils.
- Atualizado o plugin OsTrackerPlugin para incluir a funcionalidade de baixar o relatório da OS.
- Adicionada a capacidade de editar dados da OS (nome, cliente, nome comercial, CNPJ) no plugin OsTrackerPlugin.
- Atualizada a documentação para refletir as novas funcionalidades e alterações.
- Modificações no changelog para incluir as novas funcionalidades e melhorias.
</commit_message>
<xml_diff>
--- a/core/template/MODELO_RELATORIO_OS.docx
+++ b/core/template/MODELO_RELATORIO_OS.docx
@@ -4,15 +4,514 @@
   <w:body>
     <w:p>
       <w:pPr>
-        <w:jc w:val="both"/>
-      </w:pPr>
+        <w:pStyle w:val="Ttulo1"/>
+      </w:pPr>
+      <w:r>
+        <w:t>RELATÓRIO DA OS {{os}}</w:t>
+      </w:r>
     </w:p>
-    <w:p/>
     <w:p>
-      <w:pPr>
-        <w:jc w:val="center"/>
-      </w:pPr>
+      <w:r>
+        <w:t>Emitido em {{gerado_em}}.</w:t>
+      </w:r>
     </w:p>
+    <w:p>
+      <w:pPr>
+        <w:pStyle w:val="Ttulo2"/>
+      </w:pPr>
+      <w:r>
+        <w:t>Dados Gerais</w:t>
+      </w:r>
+    </w:p>
+    <w:tbl>
+      <w:tblPr>
+        <w:tblStyle w:val="Tabelacomgrade"/>
+        <w:tblW w:type="auto" w:w="0"/>
+        <w:tblLook w:firstColumn="1" w:firstRow="1" w:lastColumn="0" w:lastRow="0" w:noHBand="0" w:noVBand="1" w:val="04A0"/>
+      </w:tblPr>
+      <w:tblGrid>
+        <w:gridCol w:w="4252"/>
+        <w:gridCol w:w="4252"/>
+      </w:tblGrid>
+      <w:tr>
+        <w:tc>
+          <w:tcPr>
+            <w:tcW w:type="dxa" w:w="4252"/>
+          </w:tcPr>
+          <w:p>
+            <w:r>
+              <w:t>OS</w:t>
+            </w:r>
+          </w:p>
+        </w:tc>
+        <w:tc>
+          <w:tcPr>
+            <w:tcW w:type="dxa" w:w="4252"/>
+          </w:tcPr>
+          <w:p>
+            <w:r>
+              <w:t>{{os}}</w:t>
+            </w:r>
+          </w:p>
+        </w:tc>
+      </w:tr>
+      <w:tr>
+        <w:tc>
+          <w:tcPr>
+            <w:tcW w:type="dxa" w:w="4252"/>
+          </w:tcPr>
+          <w:p>
+            <w:r>
+              <w:t>Nome</w:t>
+            </w:r>
+          </w:p>
+        </w:tc>
+        <w:tc>
+          <w:tcPr>
+            <w:tcW w:type="dxa" w:w="4252"/>
+          </w:tcPr>
+          <w:p>
+            <w:r>
+              <w:t>{{nome}}</w:t>
+            </w:r>
+          </w:p>
+        </w:tc>
+      </w:tr>
+      <w:tr>
+        <w:tc>
+          <w:tcPr>
+            <w:tcW w:type="dxa" w:w="4252"/>
+          </w:tcPr>
+          <w:p>
+            <w:r>
+              <w:t>Cliente</w:t>
+            </w:r>
+          </w:p>
+        </w:tc>
+        <w:tc>
+          <w:tcPr>
+            <w:tcW w:type="dxa" w:w="4252"/>
+          </w:tcPr>
+          <w:p>
+            <w:r>
+              <w:t>{{cliente}}</w:t>
+            </w:r>
+          </w:p>
+        </w:tc>
+      </w:tr>
+      <w:tr>
+        <w:tc>
+          <w:tcPr>
+            <w:tcW w:type="dxa" w:w="4252"/>
+          </w:tcPr>
+          <w:p>
+            <w:r>
+              <w:t>Nome comercial</w:t>
+            </w:r>
+          </w:p>
+        </w:tc>
+        <w:tc>
+          <w:tcPr>
+            <w:tcW w:type="dxa" w:w="4252"/>
+          </w:tcPr>
+          <w:p>
+            <w:r>
+              <w:t>{{nome_comercial}}</w:t>
+            </w:r>
+          </w:p>
+        </w:tc>
+      </w:tr>
+      <w:tr>
+        <w:tc>
+          <w:tcPr>
+            <w:tcW w:type="dxa" w:w="4252"/>
+          </w:tcPr>
+          <w:p>
+            <w:r>
+              <w:t>CNPJ</w:t>
+            </w:r>
+          </w:p>
+        </w:tc>
+        <w:tc>
+          <w:tcPr>
+            <w:tcW w:type="dxa" w:w="4252"/>
+          </w:tcPr>
+          <w:p>
+            <w:r>
+              <w:t>{{cnpj}}</w:t>
+            </w:r>
+          </w:p>
+        </w:tc>
+      </w:tr>
+      <w:tr>
+        <w:tc>
+          <w:tcPr>
+            <w:tcW w:type="dxa" w:w="4252"/>
+          </w:tcPr>
+          <w:p>
+            <w:r>
+              <w:t>Pasta</w:t>
+            </w:r>
+          </w:p>
+        </w:tc>
+        <w:tc>
+          <w:tcPr>
+            <w:tcW w:type="dxa" w:w="4252"/>
+          </w:tcPr>
+          <w:p>
+            <w:r>
+              <w:t>{{pasta}}</w:t>
+            </w:r>
+          </w:p>
+        </w:tc>
+      </w:tr>
+      <w:tr>
+        <w:tc>
+          <w:tcPr>
+            <w:tcW w:type="dxa" w:w="4252"/>
+          </w:tcPr>
+          <w:p>
+            <w:r>
+              <w:t>Pastas criadas</w:t>
+            </w:r>
+          </w:p>
+        </w:tc>
+        <w:tc>
+          <w:tcPr>
+            <w:tcW w:type="dxa" w:w="4252"/>
+          </w:tcPr>
+          <w:p>
+            <w:r>
+              <w:t>{{pastas_criadas}}</w:t>
+            </w:r>
+          </w:p>
+        </w:tc>
+      </w:tr>
+      <w:tr>
+        <w:tc>
+          <w:tcPr>
+            <w:tcW w:type="dxa" w:w="4252"/>
+          </w:tcPr>
+          <w:p>
+            <w:r>
+              <w:t>Pastas</w:t>
+            </w:r>
+          </w:p>
+        </w:tc>
+        <w:tc>
+          <w:tcPr>
+            <w:tcW w:type="dxa" w:w="4252"/>
+          </w:tcPr>
+          <w:p>
+            <w:r>
+              <w:t>{{lista_pastas}}</w:t>
+            </w:r>
+          </w:p>
+        </w:tc>
+      </w:tr>
+      <w:tr>
+        <w:tc>
+          <w:tcPr>
+            <w:tcW w:type="dxa" w:w="4252"/>
+          </w:tcPr>
+          <w:p>
+            <w:r>
+              <w:t>Anos criados</w:t>
+            </w:r>
+          </w:p>
+        </w:tc>
+        <w:tc>
+          <w:tcPr>
+            <w:tcW w:type="dxa" w:w="4252"/>
+          </w:tcPr>
+          <w:p>
+            <w:r>
+              <w:t>{{anos_criados}}</w:t>
+            </w:r>
+          </w:p>
+        </w:tc>
+      </w:tr>
+      <w:tr>
+        <w:tc>
+          <w:tcPr>
+            <w:tcW w:type="dxa" w:w="4252"/>
+          </w:tcPr>
+          <w:p>
+            <w:r>
+              <w:t>Última atualização</w:t>
+            </w:r>
+          </w:p>
+        </w:tc>
+        <w:tc>
+          <w:tcPr>
+            <w:tcW w:type="dxa" w:w="4252"/>
+          </w:tcPr>
+          <w:p>
+            <w:r>
+              <w:t>{{atualizado_em}}</w:t>
+            </w:r>
+          </w:p>
+        </w:tc>
+      </w:tr>
+    </w:tbl>
+    <w:p>
+      <w:pPr>
+        <w:pStyle w:val="Ttulo2"/>
+      </w:pPr>
+      <w:r>
+        <w:t>Base de Limites</w:t>
+      </w:r>
+    </w:p>
+    <w:tbl>
+      <w:tblPr>
+        <w:tblStyle w:val="Tabelacomgrade"/>
+        <w:tblW w:type="auto" w:w="0"/>
+        <w:tblLook w:firstColumn="1" w:firstRow="1" w:lastColumn="0" w:lastRow="0" w:noHBand="0" w:noVBand="1" w:val="04A0"/>
+      </w:tblPr>
+      <w:tblGrid>
+        <w:gridCol w:w="4252"/>
+        <w:gridCol w:w="4252"/>
+      </w:tblGrid>
+      <w:tr>
+        <w:tc>
+          <w:tcPr>
+            <w:tcW w:type="dxa" w:w="4252"/>
+          </w:tcPr>
+          <w:p>
+            <w:r>
+              <w:t>Feições</w:t>
+            </w:r>
+          </w:p>
+        </w:tc>
+        <w:tc>
+          <w:tcPr>
+            <w:tcW w:type="dxa" w:w="4252"/>
+          </w:tcPr>
+          <w:p>
+            <w:r>
+              <w:t>{{limites_feicoes}}</w:t>
+            </w:r>
+          </w:p>
+        </w:tc>
+      </w:tr>
+      <w:tr>
+        <w:tc>
+          <w:tcPr>
+            <w:tcW w:type="dxa" w:w="4252"/>
+          </w:tcPr>
+          <w:p>
+            <w:r>
+              <w:t>Área (ha)</w:t>
+            </w:r>
+          </w:p>
+        </w:tc>
+        <w:tc>
+          <w:tcPr>
+            <w:tcW w:type="dxa" w:w="4252"/>
+          </w:tcPr>
+          <w:p>
+            <w:r>
+              <w:t>{{limites_area}}</w:t>
+            </w:r>
+          </w:p>
+        </w:tc>
+      </w:tr>
+      <w:tr>
+        <w:tc>
+          <w:tcPr>
+            <w:tcW w:type="dxa" w:w="4252"/>
+          </w:tcPr>
+          <w:p>
+            <w:r>
+              <w:t>Arquivo</w:t>
+            </w:r>
+          </w:p>
+        </w:tc>
+        <w:tc>
+          <w:tcPr>
+            <w:tcW w:type="dxa" w:w="4252"/>
+          </w:tcPr>
+          <w:p>
+            <w:r>
+              <w:t>{{limites_arquivo}}</w:t>
+            </w:r>
+          </w:p>
+        </w:tc>
+      </w:tr>
+      <w:tr>
+        <w:tc>
+          <w:tcPr>
+            <w:tcW w:type="dxa" w:w="4252"/>
+          </w:tcPr>
+          <w:p>
+            <w:r>
+              <w:t>Origem</w:t>
+            </w:r>
+          </w:p>
+        </w:tc>
+        <w:tc>
+          <w:tcPr>
+            <w:tcW w:type="dxa" w:w="4252"/>
+          </w:tcPr>
+          <w:p>
+            <w:r>
+              <w:t>{{limites_origem}}</w:t>
+            </w:r>
+          </w:p>
+        </w:tc>
+      </w:tr>
+      <w:tr>
+        <w:tc>
+          <w:tcPr>
+            <w:tcW w:type="dxa" w:w="4252"/>
+          </w:tcPr>
+          <w:p>
+            <w:r>
+              <w:t>Registrado em</w:t>
+            </w:r>
+          </w:p>
+        </w:tc>
+        <w:tc>
+          <w:tcPr>
+            <w:tcW w:type="dxa" w:w="4252"/>
+          </w:tcPr>
+          <w:p>
+            <w:r>
+              <w:t>{{limites_registrado}}</w:t>
+            </w:r>
+          </w:p>
+        </w:tc>
+      </w:tr>
+    </w:tbl>
+    <w:p>
+      <w:pPr>
+        <w:pStyle w:val="Ttulo2"/>
+      </w:pPr>
+      <w:r>
+        <w:t>Base de Zonas de Manejo</w:t>
+      </w:r>
+    </w:p>
+    <w:tbl>
+      <w:tblPr>
+        <w:tblStyle w:val="Tabelacomgrade"/>
+        <w:tblW w:type="auto" w:w="0"/>
+        <w:tblLook w:firstColumn="1" w:firstRow="1" w:lastColumn="0" w:lastRow="0" w:noHBand="0" w:noVBand="1" w:val="04A0"/>
+      </w:tblPr>
+      <w:tblGrid>
+        <w:gridCol w:w="4252"/>
+        <w:gridCol w:w="4252"/>
+      </w:tblGrid>
+      <w:tr>
+        <w:tc>
+          <w:tcPr>
+            <w:tcW w:type="dxa" w:w="4252"/>
+          </w:tcPr>
+          <w:p>
+            <w:r>
+              <w:t>Feições</w:t>
+            </w:r>
+          </w:p>
+        </w:tc>
+        <w:tc>
+          <w:tcPr>
+            <w:tcW w:type="dxa" w:w="4252"/>
+          </w:tcPr>
+          <w:p>
+            <w:r>
+              <w:t>{{zonas_feicoes}}</w:t>
+            </w:r>
+          </w:p>
+        </w:tc>
+      </w:tr>
+      <w:tr>
+        <w:tc>
+          <w:tcPr>
+            <w:tcW w:type="dxa" w:w="4252"/>
+          </w:tcPr>
+          <w:p>
+            <w:r>
+              <w:t>Área (ha)</w:t>
+            </w:r>
+          </w:p>
+        </w:tc>
+        <w:tc>
+          <w:tcPr>
+            <w:tcW w:type="dxa" w:w="4252"/>
+          </w:tcPr>
+          <w:p>
+            <w:r>
+              <w:t>{{zonas_area}}</w:t>
+            </w:r>
+          </w:p>
+        </w:tc>
+      </w:tr>
+      <w:tr>
+        <w:tc>
+          <w:tcPr>
+            <w:tcW w:type="dxa" w:w="4252"/>
+          </w:tcPr>
+          <w:p>
+            <w:r>
+              <w:t>Arquivo</w:t>
+            </w:r>
+          </w:p>
+        </w:tc>
+        <w:tc>
+          <w:tcPr>
+            <w:tcW w:type="dxa" w:w="4252"/>
+          </w:tcPr>
+          <w:p>
+            <w:r>
+              <w:t>{{zonas_arquivo}}</w:t>
+            </w:r>
+          </w:p>
+        </w:tc>
+      </w:tr>
+      <w:tr>
+        <w:tc>
+          <w:tcPr>
+            <w:tcW w:type="dxa" w:w="4252"/>
+          </w:tcPr>
+          <w:p>
+            <w:r>
+              <w:t>Origem</w:t>
+            </w:r>
+          </w:p>
+        </w:tc>
+        <w:tc>
+          <w:tcPr>
+            <w:tcW w:type="dxa" w:w="4252"/>
+          </w:tcPr>
+          <w:p>
+            <w:r>
+              <w:t>{{zonas_origem}}</w:t>
+            </w:r>
+          </w:p>
+        </w:tc>
+      </w:tr>
+      <w:tr>
+        <w:tc>
+          <w:tcPr>
+            <w:tcW w:type="dxa" w:w="4252"/>
+          </w:tcPr>
+          <w:p>
+            <w:r>
+              <w:t>Registrado em</w:t>
+            </w:r>
+          </w:p>
+        </w:tc>
+        <w:tc>
+          <w:tcPr>
+            <w:tcW w:type="dxa" w:w="4252"/>
+          </w:tcPr>
+          <w:p>
+            <w:r>
+              <w:t>{{zonas_registrado}}</w:t>
+            </w:r>
+          </w:p>
+        </w:tc>
+      </w:tr>
+    </w:tbl>
     <w:sectPr>
       <w:headerReference w:type="even" r:id="rId8"/>
       <w:headerReference w:type="default" r:id="rId9"/>

</xml_diff>